<commit_message>
Complete equipment addresses and scoped child migration exports
</commit_message>
<xml_diff>
--- a/docs/customer/commercial/ModuPorter-EAM-Manual-DE-1.0.0.docx
+++ b/docs/customer/commercial/ModuPorter-EAM-Manual-DE-1.0.0.docx
@@ -152,7 +152,7 @@
                 <w:color w:val="000000"/>
                 <w:sz w:val="20"/>
               </w:rPr>
-              <w:t>41</w:t>
+              <w:t>46</w:t>
             </w:r>
           </w:p>
         </w:tc>
@@ -171,7 +171,7 @@
                 <w:color w:val="000000"/>
                 <w:sz w:val="20"/>
               </w:rPr>
-              <w:t>158</w:t>
+              <w:t>169</w:t>
             </w:r>
           </w:p>
         </w:tc>
@@ -490,7 +490,7 @@
                 <w:color w:val="000000"/>
                 <w:sz w:val="20"/>
               </w:rPr>
-              <w:t>10</w:t>
+              <w:t>21</w:t>
             </w:r>
           </w:p>
         </w:tc>
@@ -1015,7 +1015,7 @@
     <w:p/>
     <w:p>
       <w:r>
-        <w:t>Equipment enthält gemeinsame Referenzen und Arbeitsplatzabhängigkeiten. Texte erhalten ihre Sprachschlüssel. Langtexte werden über READ_TEXT gelesen; komprimierte Inhalte sind keine CDS-Zeilen. Historische Stichtage, Änderungsstände und freigegebene technische Objektpopulationen richten sich nach docs/CUSTOMER_WORKFLOW.md.</w:t>
+        <w:t>Equipment liefert einen aktuellen Stammsatz mit Standardpostanschrift. Texte, Partner, Status und Adressversionen bleiben separat. Alle Kindstrukturen verwenden dieselbe Equipment-Auswahl. Systemstatus dienen als Referenz; Anwenderstatus erfordern eine unterstützte Nachverarbeitung. Langtextinhalte werden über READ_TEXT gelesen. Vollständige Stichtagsabzüge verwenden. Siehe docs/EQUIPMENT_ARCHITECTURE.md und docs/CUSTOMER_WORKFLOW.md.</w:t>
       </w:r>
     </w:p>
     <w:p>

</xml_diff>